<commit_message>
docs: actualiza la URL publica de la aplicacion desplegada
La aplicacion quedo publicada en Streamlit Community Cloud bajo el subdominio
asignado automaticamente. Se actualiza el enlace en la portada del cuaderno, en
la seccion 6 de despliegue, en el README y en el documento de entrega.

Co-Authored-By: Claude Opus 5 <noreply@anthropic.com>
</commit_message>
<xml_diff>
--- a/U4_A1_Entrega_Proyecto_Integrador_Saber11.docx
+++ b/U4_A1_Entrega_Proyecto_Integrador_Saber11.docx
@@ -233,7 +233,7 @@
           </w:tcPr>
           <w:p>
             <w:r>
-              <w:t>https://saber11-desempeno-alto.streamlit.app</w:t>
+              <w:t>https://proyectointegrador-uwjvxhrlyvwpueji8hmttm.streamlit.app</w:t>
             </w:r>
           </w:p>
         </w:tc>
@@ -8517,7 +8517,7 @@
           </w:tcPr>
           <w:p>
             <w:r>
-              <w:t>Sí — https://saber11-desempeno-alto.streamlit.app</w:t>
+              <w:t>Sí — https://proyectointegrador-uwjvxhrlyvwpueji8hmttm.streamlit.app</w:t>
             </w:r>
           </w:p>
         </w:tc>
@@ -8637,7 +8637,7 @@
           </w:tcPr>
           <w:p>
             <w:r>
-              <w:t>https://saber11-desempeno-alto.streamlit.app</w:t>
+              <w:t>https://proyectointegrador-uwjvxhrlyvwpueji8hmttm.streamlit.app</w:t>
             </w:r>
           </w:p>
         </w:tc>

</xml_diff>

<commit_message>
docs: incorpora la evidencia de la aplicacion desplegada
Se anaden dos figuras al documento de entrega: la aplicacion corriendo en
Streamlit Community Cloud con la URL publica visible en el navegador, y el
detalle del resultado de una prediccion individual. Se agrega ademas un
archivo con los enlaces y datos clave de la entrega.

Co-Authored-By: Claude Opus 5 <noreply@anthropic.com>
</commit_message>
<xml_diff>
--- a/U4_A1_Entrega_Proyecto_Integrador_Saber11.docx
+++ b/U4_A1_Entrega_Proyecto_Integrador_Saber11.docx
@@ -8542,7 +8542,7 @@
           </w:tcPr>
           <w:p>
             <w:r>
-              <w:t>Sí — ver la figura de la sección 6.2</w:t>
+              <w:t>Sí — ver las figuras 1 y 2 de la sección 6</w:t>
             </w:r>
           </w:p>
         </w:tc>
@@ -8668,7 +8668,7 @@
       <w:r>
         <w:drawing>
           <wp:inline xmlns:a="http://schemas.openxmlformats.org/drawingml/2006/main" xmlns:pic="http://schemas.openxmlformats.org/drawingml/2006/picture">
-            <wp:extent cx="5760720" cy="6413412"/>
+            <wp:extent cx="5760720" cy="4813847"/>
             <wp:docPr id="1" name="Picture 1"/>
             <wp:cNvGraphicFramePr>
               <a:graphicFrameLocks noChangeAspect="1"/>
@@ -8682,6 +8682,57 @@
                   </pic:nvPicPr>
                   <pic:blipFill>
                     <a:blip r:embed="rId9"/>
+                    <a:stretch>
+                      <a:fillRect/>
+                    </a:stretch>
+                  </pic:blipFill>
+                  <pic:spPr>
+                    <a:xfrm>
+                      <a:off x="0" y="0"/>
+                      <a:ext cx="5760720" cy="4813847"/>
+                    </a:xfrm>
+                    <a:prstGeom prst="rect"/>
+                  </pic:spPr>
+                </pic:pic>
+              </a:graphicData>
+            </a:graphic>
+          </wp:inline>
+        </w:drawing>
+      </w:r>
+    </w:p>
+    <w:p>
+      <w:pPr>
+        <w:jc w:val="center"/>
+      </w:pPr>
+      <w:r>
+        <w:rPr>
+          <w:i/>
+          <w:sz w:val="18"/>
+        </w:rPr>
+        <w:t>Figura 1. Aplicación desplegada y accesible públicamente en proyectointegrador-uwjvxhrlyvwpueji8hmttm.streamlit.app, con la URL visible en la barra de direcciones del navegador.</w:t>
+      </w:r>
+    </w:p>
+    <w:p>
+      <w:pPr>
+        <w:jc w:val="center"/>
+      </w:pPr>
+      <w:r>
+        <w:drawing>
+          <wp:inline xmlns:a="http://schemas.openxmlformats.org/drawingml/2006/main" xmlns:pic="http://schemas.openxmlformats.org/drawingml/2006/picture">
+            <wp:extent cx="5760720" cy="6413412"/>
+            <wp:docPr id="2" name="Picture 2"/>
+            <wp:cNvGraphicFramePr>
+              <a:graphicFrameLocks noChangeAspect="1"/>
+            </wp:cNvGraphicFramePr>
+            <a:graphic>
+              <a:graphicData uri="http://schemas.openxmlformats.org/drawingml/2006/picture">
+                <pic:pic>
+                  <pic:nvPicPr>
+                    <pic:cNvPr id="0" name="pantallazo_app_prediccion.png"/>
+                    <pic:cNvPicPr/>
+                  </pic:nvPicPr>
+                  <pic:blipFill>
+                    <a:blip r:embed="rId10"/>
                     <a:stretch>
                       <a:fillRect/>
                     </a:stretch>
@@ -8709,7 +8760,7 @@
           <w:i/>
           <w:sz w:val="18"/>
         </w:rPr>
-        <w:t>Aplicación Streamlit ejecutando una predicción individual: para un estudiante de estrato 2, colegio oficial urbano de jornada completa y padres bachilleres, el modelo estima una probabilidad del 67,1 % de alcanzar 300 puntos, la clasifica como ALTO y le asigna prioridad de acompañamiento BAJA.</w:t>
+        <w:t>Figura 2. Resultado completo de una predicción individual: para un estudiante de estrato 2, colegio oficial urbano de jornada completa y padres bachilleres, el modelo estima una probabilidad del 67,1 % de alcanzar 300 puntos, la clasifica como ALTO y le asigna prioridad de acompañamiento BAJA.</w:t>
       </w:r>
     </w:p>
     <w:sectPr>

</xml_diff>